<commit_message>
Hoàn thành xong Mục 3.2: Phân tích ca sử dụng (Use Case) trong Chương 3
</commit_message>
<xml_diff>
--- a/thesis/outline/170123295_PHAMNHATHAO_DX23TT10.docx
+++ b/thesis/outline/170123295_PHAMNHATHAO_DX23TT10.docx
@@ -1118,6 +1118,12 @@
     </w:p>
     <w:sdt>
       <w:sdtPr>
+        <w:rPr>
+          <w:rFonts w:ascii="Aptos" w:eastAsia="Aptos" w:hAnsi="Aptos" w:cs="Aptos"/>
+          <w:color w:val="auto"/>
+          <w:sz w:val="24"/>
+          <w:szCs w:val="24"/>
+        </w:rPr>
         <w:id w:val="-802923937"/>
         <w:docPartObj>
           <w:docPartGallery w:val="Table of Contents"/>
@@ -1126,13 +1132,9 @@
       </w:sdtPr>
       <w:sdtEndPr>
         <w:rPr>
-          <w:rFonts w:ascii="Aptos" w:eastAsia="Aptos" w:hAnsi="Aptos" w:cs="Aptos"/>
           <w:b/>
           <w:bCs/>
           <w:noProof/>
-          <w:color w:val="auto"/>
-          <w:sz w:val="24"/>
-          <w:szCs w:val="24"/>
         </w:rPr>
       </w:sdtEndPr>
       <w:sdtContent>
@@ -8572,8 +8574,8 @@
         </w:rPr>
         <w:t xml:space="preserve">CỘNG HOÀ XÃ HỘI CHỦ NGHĨA VIỆT </w:t>
       </w:r>
-      <w:smartTag w:uri="urn:schemas-microsoft-com:office:smarttags" w:element="country-region">
-        <w:smartTag w:uri="urn:schemas-microsoft-com:office:smarttags" w:element="place">
+      <w:smartTag w:uri="urn:schemas-microsoft-com:office:smarttags" w:element="place">
+        <w:smartTag w:uri="urn:schemas-microsoft-com:office:smarttags" w:element="country-region">
           <w:r>
             <w:rPr>
               <w:rFonts w:ascii="Times New Roman" w:hAnsi="Times New Roman"/>
@@ -12353,8 +12355,905 @@
         <w:t>Kết nối database ổn định và hiển thị hình ảnh thục tế từ thư mục images.</w:t>
       </w:r>
     </w:p>
+    <w:p>
+      <w:pPr>
+        <w:jc w:val="both"/>
+        <w:rPr>
+          <w:rFonts w:ascii="Times New Roman" w:eastAsia="Bold" w:hAnsi="Times New Roman" w:cs="Times New Roman"/>
+          <w:b/>
+          <w:sz w:val="26"/>
+          <w:szCs w:val="26"/>
+          <w:lang w:val="vi-VN"/>
+        </w:rPr>
+      </w:pPr>
+      <w:r>
+        <w:rPr>
+          <w:rFonts w:ascii="Times New Roman" w:eastAsia="Bold" w:hAnsi="Times New Roman" w:cs="Times New Roman"/>
+          <w:b/>
+          <w:sz w:val="26"/>
+          <w:szCs w:val="26"/>
+          <w:lang w:val="vi-VN"/>
+        </w:rPr>
+        <w:lastRenderedPageBreak/>
+        <w:t>3.2 Sơ đồ Use Case Diagram và bảng đặc tả</w:t>
+      </w:r>
+    </w:p>
+    <w:p>
+      <w:pPr>
+        <w:jc w:val="both"/>
+        <w:rPr>
+          <w:rFonts w:ascii="Times New Roman" w:eastAsia="Bold" w:hAnsi="Times New Roman" w:cs="Times New Roman"/>
+          <w:bCs/>
+          <w:sz w:val="26"/>
+          <w:szCs w:val="26"/>
+          <w:lang w:val="vi-VN"/>
+        </w:rPr>
+      </w:pPr>
+      <w:r>
+        <w:rPr>
+          <w:rFonts w:ascii="Times New Roman" w:eastAsia="Bold" w:hAnsi="Times New Roman" w:cs="Times New Roman"/>
+          <w:bCs/>
+          <w:noProof/>
+          <w:sz w:val="26"/>
+          <w:szCs w:val="26"/>
+          <w:lang w:val="vi-VN"/>
+          <w14:ligatures w14:val="standardContextual"/>
+        </w:rPr>
+        <w:drawing>
+          <wp:anchor distT="0" distB="0" distL="114300" distR="114300" simplePos="0" relativeHeight="251668480" behindDoc="1" locked="0" layoutInCell="1" allowOverlap="1" wp14:anchorId="6947BEC1" wp14:editId="75FF672D">
+            <wp:simplePos x="0" y="0"/>
+            <wp:positionH relativeFrom="column">
+              <wp:posOffset>-1</wp:posOffset>
+            </wp:positionH>
+            <wp:positionV relativeFrom="paragraph">
+              <wp:posOffset>154940</wp:posOffset>
+            </wp:positionV>
+            <wp:extent cx="6048375" cy="4962525"/>
+            <wp:effectExtent l="0" t="0" r="9525" b="9525"/>
+            <wp:wrapNone/>
+            <wp:docPr id="1113985913" name="Picture 5"/>
+            <wp:cNvGraphicFramePr>
+              <a:graphicFrameLocks xmlns:a="http://schemas.openxmlformats.org/drawingml/2006/main" noChangeAspect="1"/>
+            </wp:cNvGraphicFramePr>
+            <a:graphic xmlns:a="http://schemas.openxmlformats.org/drawingml/2006/main">
+              <a:graphicData uri="http://schemas.openxmlformats.org/drawingml/2006/picture">
+                <pic:pic xmlns:pic="http://schemas.openxmlformats.org/drawingml/2006/picture">
+                  <pic:nvPicPr>
+                    <pic:cNvPr id="1113985913" name="Picture 1113985913"/>
+                    <pic:cNvPicPr/>
+                  </pic:nvPicPr>
+                  <pic:blipFill>
+                    <a:blip r:embed="rId12">
+                      <a:extLst>
+                        <a:ext uri="{28A0092B-C50C-407E-A947-70E740481C1C}">
+                          <a14:useLocalDpi xmlns:a14="http://schemas.microsoft.com/office/drawing/2010/main" val="0"/>
+                        </a:ext>
+                      </a:extLst>
+                    </a:blip>
+                    <a:stretch>
+                      <a:fillRect/>
+                    </a:stretch>
+                  </pic:blipFill>
+                  <pic:spPr>
+                    <a:xfrm>
+                      <a:off x="0" y="0"/>
+                      <a:ext cx="6048375" cy="4962525"/>
+                    </a:xfrm>
+                    <a:prstGeom prst="rect">
+                      <a:avLst/>
+                    </a:prstGeom>
+                  </pic:spPr>
+                </pic:pic>
+              </a:graphicData>
+            </a:graphic>
+            <wp14:sizeRelH relativeFrom="margin">
+              <wp14:pctWidth>0</wp14:pctWidth>
+            </wp14:sizeRelH>
+          </wp:anchor>
+        </w:drawing>
+      </w:r>
+    </w:p>
+    <w:p>
+      <w:pPr>
+        <w:jc w:val="both"/>
+        <w:rPr>
+          <w:rFonts w:ascii="Times New Roman" w:eastAsia="Bold" w:hAnsi="Times New Roman" w:cs="Times New Roman"/>
+          <w:bCs/>
+          <w:sz w:val="26"/>
+          <w:szCs w:val="26"/>
+          <w:lang w:val="vi-VN"/>
+        </w:rPr>
+      </w:pPr>
+    </w:p>
+    <w:p>
+      <w:pPr>
+        <w:rPr>
+          <w:rFonts w:ascii="Times New Roman" w:eastAsia="Bold" w:hAnsi="Times New Roman" w:cs="Times New Roman"/>
+          <w:sz w:val="26"/>
+          <w:szCs w:val="26"/>
+          <w:lang w:val="vi-VN"/>
+        </w:rPr>
+      </w:pPr>
+    </w:p>
+    <w:p>
+      <w:pPr>
+        <w:rPr>
+          <w:rFonts w:ascii="Times New Roman" w:eastAsia="Bold" w:hAnsi="Times New Roman" w:cs="Times New Roman"/>
+          <w:sz w:val="26"/>
+          <w:szCs w:val="26"/>
+          <w:lang w:val="vi-VN"/>
+        </w:rPr>
+      </w:pPr>
+    </w:p>
+    <w:p>
+      <w:pPr>
+        <w:rPr>
+          <w:rFonts w:ascii="Times New Roman" w:eastAsia="Bold" w:hAnsi="Times New Roman" w:cs="Times New Roman"/>
+          <w:sz w:val="26"/>
+          <w:szCs w:val="26"/>
+          <w:lang w:val="vi-VN"/>
+        </w:rPr>
+      </w:pPr>
+    </w:p>
+    <w:p>
+      <w:pPr>
+        <w:rPr>
+          <w:rFonts w:ascii="Times New Roman" w:eastAsia="Bold" w:hAnsi="Times New Roman" w:cs="Times New Roman"/>
+          <w:sz w:val="26"/>
+          <w:szCs w:val="26"/>
+          <w:lang w:val="vi-VN"/>
+        </w:rPr>
+      </w:pPr>
+    </w:p>
+    <w:p>
+      <w:pPr>
+        <w:rPr>
+          <w:rFonts w:ascii="Times New Roman" w:eastAsia="Bold" w:hAnsi="Times New Roman" w:cs="Times New Roman"/>
+          <w:sz w:val="26"/>
+          <w:szCs w:val="26"/>
+          <w:lang w:val="vi-VN"/>
+        </w:rPr>
+      </w:pPr>
+    </w:p>
+    <w:p>
+      <w:pPr>
+        <w:rPr>
+          <w:rFonts w:ascii="Times New Roman" w:eastAsia="Bold" w:hAnsi="Times New Roman" w:cs="Times New Roman"/>
+          <w:sz w:val="26"/>
+          <w:szCs w:val="26"/>
+          <w:lang w:val="vi-VN"/>
+        </w:rPr>
+      </w:pPr>
+    </w:p>
+    <w:p>
+      <w:pPr>
+        <w:rPr>
+          <w:rFonts w:ascii="Times New Roman" w:eastAsia="Bold" w:hAnsi="Times New Roman" w:cs="Times New Roman"/>
+          <w:sz w:val="26"/>
+          <w:szCs w:val="26"/>
+          <w:lang w:val="vi-VN"/>
+        </w:rPr>
+      </w:pPr>
+    </w:p>
+    <w:p>
+      <w:pPr>
+        <w:rPr>
+          <w:rFonts w:ascii="Times New Roman" w:eastAsia="Bold" w:hAnsi="Times New Roman" w:cs="Times New Roman"/>
+          <w:sz w:val="26"/>
+          <w:szCs w:val="26"/>
+          <w:lang w:val="vi-VN"/>
+        </w:rPr>
+      </w:pPr>
+    </w:p>
+    <w:p>
+      <w:pPr>
+        <w:rPr>
+          <w:rFonts w:ascii="Times New Roman" w:eastAsia="Bold" w:hAnsi="Times New Roman" w:cs="Times New Roman"/>
+          <w:sz w:val="26"/>
+          <w:szCs w:val="26"/>
+          <w:lang w:val="vi-VN"/>
+        </w:rPr>
+      </w:pPr>
+    </w:p>
+    <w:p>
+      <w:pPr>
+        <w:rPr>
+          <w:rFonts w:ascii="Times New Roman" w:eastAsia="Bold" w:hAnsi="Times New Roman" w:cs="Times New Roman"/>
+          <w:sz w:val="26"/>
+          <w:szCs w:val="26"/>
+          <w:lang w:val="vi-VN"/>
+        </w:rPr>
+      </w:pPr>
+    </w:p>
+    <w:p>
+      <w:pPr>
+        <w:rPr>
+          <w:rFonts w:ascii="Times New Roman" w:eastAsia="Bold" w:hAnsi="Times New Roman" w:cs="Times New Roman"/>
+          <w:sz w:val="26"/>
+          <w:szCs w:val="26"/>
+          <w:lang w:val="vi-VN"/>
+        </w:rPr>
+      </w:pPr>
+    </w:p>
+    <w:p>
+      <w:pPr>
+        <w:rPr>
+          <w:rFonts w:ascii="Times New Roman" w:eastAsia="Bold" w:hAnsi="Times New Roman" w:cs="Times New Roman"/>
+          <w:sz w:val="26"/>
+          <w:szCs w:val="26"/>
+          <w:lang w:val="vi-VN"/>
+        </w:rPr>
+      </w:pPr>
+    </w:p>
+    <w:p>
+      <w:pPr>
+        <w:rPr>
+          <w:rFonts w:ascii="Times New Roman" w:eastAsia="Bold" w:hAnsi="Times New Roman" w:cs="Times New Roman"/>
+          <w:sz w:val="26"/>
+          <w:szCs w:val="26"/>
+          <w:lang w:val="vi-VN"/>
+        </w:rPr>
+      </w:pPr>
+    </w:p>
+    <w:p>
+      <w:pPr>
+        <w:rPr>
+          <w:rFonts w:ascii="Times New Roman" w:eastAsia="Bold" w:hAnsi="Times New Roman" w:cs="Times New Roman"/>
+          <w:sz w:val="26"/>
+          <w:szCs w:val="26"/>
+          <w:lang w:val="vi-VN"/>
+        </w:rPr>
+      </w:pPr>
+    </w:p>
+    <w:p>
+      <w:pPr>
+        <w:rPr>
+          <w:rFonts w:ascii="Times New Roman" w:eastAsia="Bold" w:hAnsi="Times New Roman" w:cs="Times New Roman"/>
+          <w:bCs/>
+          <w:sz w:val="26"/>
+          <w:szCs w:val="26"/>
+          <w:lang w:val="vi-VN"/>
+        </w:rPr>
+      </w:pPr>
+    </w:p>
+    <w:p>
+      <w:pPr>
+        <w:jc w:val="center"/>
+        <w:rPr>
+          <w:rFonts w:ascii="Times New Roman" w:eastAsia="Bold" w:hAnsi="Times New Roman" w:cs="Times New Roman"/>
+          <w:b/>
+          <w:bCs/>
+          <w:sz w:val="26"/>
+          <w:szCs w:val="26"/>
+          <w:lang w:val="vi-VN"/>
+        </w:rPr>
+      </w:pPr>
+      <w:r>
+        <w:rPr>
+          <w:rFonts w:ascii="Times New Roman" w:eastAsia="Bold" w:hAnsi="Times New Roman" w:cs="Times New Roman"/>
+          <w:b/>
+          <w:bCs/>
+          <w:sz w:val="26"/>
+          <w:szCs w:val="26"/>
+          <w:lang w:val="vi-VN"/>
+        </w:rPr>
+        <w:t>Hình 3.1: Hệ thống giỏ hàng</w:t>
+      </w:r>
+    </w:p>
+    <w:p>
+      <w:pPr>
+        <w:rPr>
+          <w:rFonts w:ascii="Times New Roman" w:eastAsia="Bold" w:hAnsi="Times New Roman" w:cs="Times New Roman"/>
+          <w:b/>
+          <w:bCs/>
+          <w:i/>
+          <w:iCs/>
+          <w:sz w:val="26"/>
+          <w:szCs w:val="26"/>
+          <w:lang w:val="vi-VN"/>
+        </w:rPr>
+      </w:pPr>
+      <w:r>
+        <w:rPr>
+          <w:rFonts w:ascii="Times New Roman" w:eastAsia="Bold" w:hAnsi="Times New Roman" w:cs="Times New Roman"/>
+          <w:b/>
+          <w:bCs/>
+          <w:i/>
+          <w:iCs/>
+          <w:sz w:val="26"/>
+          <w:szCs w:val="26"/>
+          <w:lang w:val="vi-VN"/>
+        </w:rPr>
+        <w:t>3.2.1 Bảng đặc tả</w:t>
+      </w:r>
+    </w:p>
+    <w:p>
+      <w:pPr>
+        <w:rPr>
+          <w:rFonts w:ascii="Times New Roman" w:eastAsia="Bold" w:hAnsi="Times New Roman" w:cs="Times New Roman"/>
+          <w:sz w:val="26"/>
+          <w:szCs w:val="26"/>
+          <w:lang w:val="vi-VN"/>
+        </w:rPr>
+      </w:pPr>
+      <w:r>
+        <w:rPr>
+          <w:rFonts w:ascii="Times New Roman" w:eastAsia="Bold" w:hAnsi="Times New Roman" w:cs="Times New Roman"/>
+          <w:sz w:val="26"/>
+          <w:szCs w:val="26"/>
+          <w:lang w:val="vi-VN"/>
+        </w:rPr>
+        <w:br w:type="page"/>
+      </w:r>
+    </w:p>
+    <w:tbl>
+      <w:tblPr>
+        <w:tblStyle w:val="TableGrid"/>
+        <w:tblW w:w="0" w:type="auto"/>
+        <w:tblLook w:val="04A0" w:firstRow="1" w:lastRow="0" w:firstColumn="1" w:lastColumn="0" w:noHBand="0" w:noVBand="1"/>
+      </w:tblPr>
+      <w:tblGrid>
+        <w:gridCol w:w="4675"/>
+        <w:gridCol w:w="4675"/>
+      </w:tblGrid>
+      <w:tr>
+        <w:tc>
+          <w:tcPr>
+            <w:tcW w:w="4675" w:type="dxa"/>
+          </w:tcPr>
+          <w:p>
+            <w:pPr>
+              <w:jc w:val="center"/>
+              <w:rPr>
+                <w:rFonts w:ascii="Times New Roman" w:eastAsia="Bold" w:hAnsi="Times New Roman" w:cs="Times New Roman"/>
+                <w:b/>
+                <w:bCs/>
+                <w:sz w:val="26"/>
+                <w:szCs w:val="26"/>
+                <w:lang w:val="vi-VN"/>
+              </w:rPr>
+            </w:pPr>
+            <w:r>
+              <w:rPr>
+                <w:rFonts w:ascii="Times New Roman" w:eastAsia="Bold" w:hAnsi="Times New Roman" w:cs="Times New Roman"/>
+                <w:b/>
+                <w:bCs/>
+                <w:sz w:val="26"/>
+                <w:szCs w:val="26"/>
+                <w:lang w:val="vi-VN"/>
+              </w:rPr>
+              <w:lastRenderedPageBreak/>
+              <w:t>Thành phần đặc tả</w:t>
+            </w:r>
+          </w:p>
+        </w:tc>
+        <w:tc>
+          <w:tcPr>
+            <w:tcW w:w="4675" w:type="dxa"/>
+          </w:tcPr>
+          <w:p>
+            <w:pPr>
+              <w:jc w:val="center"/>
+              <w:rPr>
+                <w:rFonts w:ascii="Times New Roman" w:eastAsia="Bold" w:hAnsi="Times New Roman" w:cs="Times New Roman"/>
+                <w:b/>
+                <w:bCs/>
+                <w:sz w:val="26"/>
+                <w:szCs w:val="26"/>
+                <w:lang w:val="vi-VN"/>
+              </w:rPr>
+            </w:pPr>
+            <w:r>
+              <w:rPr>
+                <w:rFonts w:ascii="Times New Roman" w:eastAsia="Bold" w:hAnsi="Times New Roman" w:cs="Times New Roman"/>
+                <w:b/>
+                <w:bCs/>
+                <w:sz w:val="26"/>
+                <w:szCs w:val="26"/>
+                <w:lang w:val="vi-VN"/>
+              </w:rPr>
+              <w:t>Nội dung mô tả chi tiết hệ thống</w:t>
+            </w:r>
+          </w:p>
+        </w:tc>
+      </w:tr>
+      <w:tr>
+        <w:tc>
+          <w:tcPr>
+            <w:tcW w:w="4675" w:type="dxa"/>
+          </w:tcPr>
+          <w:p>
+            <w:pPr>
+              <w:rPr>
+                <w:rFonts w:ascii="Times New Roman" w:eastAsia="Bold" w:hAnsi="Times New Roman" w:cs="Times New Roman"/>
+                <w:sz w:val="26"/>
+                <w:szCs w:val="26"/>
+                <w:lang w:val="vi-VN"/>
+              </w:rPr>
+            </w:pPr>
+            <w:r>
+              <w:rPr>
+                <w:rFonts w:ascii="Times New Roman" w:eastAsia="Bold" w:hAnsi="Times New Roman" w:cs="Times New Roman"/>
+                <w:sz w:val="26"/>
+                <w:szCs w:val="26"/>
+                <w:lang w:val="vi-VN"/>
+              </w:rPr>
+              <w:t>Tên ca sử dụng</w:t>
+            </w:r>
+          </w:p>
+        </w:tc>
+        <w:tc>
+          <w:tcPr>
+            <w:tcW w:w="4675" w:type="dxa"/>
+          </w:tcPr>
+          <w:p>
+            <w:pPr>
+              <w:rPr>
+                <w:rFonts w:ascii="Times New Roman" w:eastAsia="Bold" w:hAnsi="Times New Roman" w:cs="Times New Roman"/>
+                <w:sz w:val="26"/>
+                <w:szCs w:val="26"/>
+                <w:lang w:val="vi-VN"/>
+              </w:rPr>
+            </w:pPr>
+            <w:r>
+              <w:rPr>
+                <w:rFonts w:ascii="Times New Roman" w:eastAsia="Bold" w:hAnsi="Times New Roman" w:cs="Times New Roman"/>
+                <w:sz w:val="26"/>
+                <w:szCs w:val="26"/>
+                <w:lang w:val="vi-VN"/>
+              </w:rPr>
+              <w:t>Quản lý giỏ hàng</w:t>
+            </w:r>
+          </w:p>
+        </w:tc>
+      </w:tr>
+      <w:tr>
+        <w:tc>
+          <w:tcPr>
+            <w:tcW w:w="4675" w:type="dxa"/>
+          </w:tcPr>
+          <w:p>
+            <w:pPr>
+              <w:rPr>
+                <w:rFonts w:ascii="Times New Roman" w:eastAsia="Bold" w:hAnsi="Times New Roman" w:cs="Times New Roman"/>
+                <w:sz w:val="26"/>
+                <w:szCs w:val="26"/>
+                <w:lang w:val="vi-VN"/>
+              </w:rPr>
+            </w:pPr>
+            <w:r>
+              <w:rPr>
+                <w:rFonts w:ascii="Times New Roman" w:eastAsia="Bold" w:hAnsi="Times New Roman" w:cs="Times New Roman"/>
+                <w:sz w:val="26"/>
+                <w:szCs w:val="26"/>
+                <w:lang w:val="vi-VN"/>
+              </w:rPr>
+              <w:t>Tác nhân</w:t>
+            </w:r>
+          </w:p>
+        </w:tc>
+        <w:tc>
+          <w:tcPr>
+            <w:tcW w:w="4675" w:type="dxa"/>
+          </w:tcPr>
+          <w:p>
+            <w:pPr>
+              <w:rPr>
+                <w:rFonts w:ascii="Times New Roman" w:eastAsia="Bold" w:hAnsi="Times New Roman" w:cs="Times New Roman"/>
+                <w:sz w:val="26"/>
+                <w:szCs w:val="26"/>
+                <w:lang w:val="vi-VN"/>
+              </w:rPr>
+            </w:pPr>
+            <w:r>
+              <w:rPr>
+                <w:rFonts w:ascii="Times New Roman" w:eastAsia="Bold" w:hAnsi="Times New Roman" w:cs="Times New Roman"/>
+                <w:sz w:val="26"/>
+                <w:szCs w:val="26"/>
+                <w:lang w:val="vi-VN"/>
+              </w:rPr>
+              <w:t>Khách hàng</w:t>
+            </w:r>
+          </w:p>
+        </w:tc>
+      </w:tr>
+      <w:tr>
+        <w:tc>
+          <w:tcPr>
+            <w:tcW w:w="4675" w:type="dxa"/>
+          </w:tcPr>
+          <w:p>
+            <w:pPr>
+              <w:rPr>
+                <w:rFonts w:ascii="Times New Roman" w:eastAsia="Bold" w:hAnsi="Times New Roman" w:cs="Times New Roman"/>
+                <w:sz w:val="26"/>
+                <w:szCs w:val="26"/>
+                <w:lang w:val="vi-VN"/>
+              </w:rPr>
+            </w:pPr>
+            <w:r>
+              <w:rPr>
+                <w:rFonts w:ascii="Times New Roman" w:eastAsia="Bold" w:hAnsi="Times New Roman" w:cs="Times New Roman"/>
+                <w:sz w:val="26"/>
+                <w:szCs w:val="26"/>
+                <w:lang w:val="vi-VN"/>
+              </w:rPr>
+              <w:t>Mô tả ngắn</w:t>
+            </w:r>
+          </w:p>
+        </w:tc>
+        <w:tc>
+          <w:tcPr>
+            <w:tcW w:w="4675" w:type="dxa"/>
+          </w:tcPr>
+          <w:p>
+            <w:pPr>
+              <w:rPr>
+                <w:rFonts w:ascii="Times New Roman" w:eastAsia="Bold" w:hAnsi="Times New Roman" w:cs="Times New Roman"/>
+                <w:sz w:val="26"/>
+                <w:szCs w:val="26"/>
+                <w:lang w:val="vi-VN"/>
+              </w:rPr>
+            </w:pPr>
+            <w:r>
+              <w:rPr>
+                <w:rFonts w:ascii="Times New Roman" w:eastAsia="Bold" w:hAnsi="Times New Roman" w:cs="Times New Roman"/>
+                <w:sz w:val="26"/>
+                <w:szCs w:val="26"/>
+                <w:lang w:val="vi-VN"/>
+              </w:rPr>
+              <w:t>Mô tả cách hệ thống tiếp nhận hành động thêm, bớt, hoặc xóa sản phẩm lưu trữ trong mảng Session từ giao diện người dùng.</w:t>
+            </w:r>
+          </w:p>
+        </w:tc>
+      </w:tr>
+      <w:tr>
+        <w:tc>
+          <w:tcPr>
+            <w:tcW w:w="4675" w:type="dxa"/>
+          </w:tcPr>
+          <w:p>
+            <w:pPr>
+              <w:rPr>
+                <w:rFonts w:ascii="Times New Roman" w:eastAsia="Bold" w:hAnsi="Times New Roman" w:cs="Times New Roman"/>
+                <w:sz w:val="26"/>
+                <w:szCs w:val="26"/>
+                <w:lang w:val="vi-VN"/>
+              </w:rPr>
+            </w:pPr>
+            <w:r>
+              <w:rPr>
+                <w:rFonts w:ascii="Times New Roman" w:eastAsia="Bold" w:hAnsi="Times New Roman" w:cs="Times New Roman"/>
+                <w:sz w:val="26"/>
+                <w:szCs w:val="26"/>
+                <w:lang w:val="vi-VN"/>
+              </w:rPr>
+              <w:t xml:space="preserve">Điều kiện tiên quyết </w:t>
+            </w:r>
+          </w:p>
+        </w:tc>
+        <w:tc>
+          <w:tcPr>
+            <w:tcW w:w="4675" w:type="dxa"/>
+          </w:tcPr>
+          <w:p>
+            <w:pPr>
+              <w:rPr>
+                <w:rFonts w:ascii="Times New Roman" w:eastAsia="Bold" w:hAnsi="Times New Roman" w:cs="Times New Roman"/>
+                <w:sz w:val="26"/>
+                <w:szCs w:val="26"/>
+                <w:lang w:val="vi-VN"/>
+              </w:rPr>
+            </w:pPr>
+            <w:r>
+              <w:rPr>
+                <w:rFonts w:ascii="Times New Roman" w:eastAsia="Bold" w:hAnsi="Times New Roman" w:cs="Times New Roman"/>
+                <w:sz w:val="26"/>
+                <w:szCs w:val="26"/>
+                <w:lang w:val="vi-VN"/>
+              </w:rPr>
+              <w:t>Khách hàng truy cập vào hệ thống website và mảng hệ thống $_SESSION[‘cart’] sẳn sàng hoạt động.</w:t>
+            </w:r>
+          </w:p>
+          <w:p>
+            <w:pPr>
+              <w:rPr>
+                <w:rFonts w:ascii="Times New Roman" w:eastAsia="Bold" w:hAnsi="Times New Roman" w:cs="Times New Roman"/>
+                <w:sz w:val="26"/>
+                <w:szCs w:val="26"/>
+                <w:lang w:val="vi-VN"/>
+              </w:rPr>
+            </w:pPr>
+          </w:p>
+        </w:tc>
+      </w:tr>
+      <w:tr>
+        <w:tc>
+          <w:tcPr>
+            <w:tcW w:w="4675" w:type="dxa"/>
+          </w:tcPr>
+          <w:p>
+            <w:pPr>
+              <w:rPr>
+                <w:rFonts w:ascii="Times New Roman" w:eastAsia="Bold" w:hAnsi="Times New Roman" w:cs="Times New Roman"/>
+                <w:sz w:val="26"/>
+                <w:szCs w:val="26"/>
+                <w:lang w:val="vi-VN"/>
+              </w:rPr>
+            </w:pPr>
+            <w:r>
+              <w:rPr>
+                <w:rFonts w:ascii="Times New Roman" w:eastAsia="Bold" w:hAnsi="Times New Roman" w:cs="Times New Roman"/>
+                <w:sz w:val="26"/>
+                <w:szCs w:val="26"/>
+                <w:lang w:val="vi-VN"/>
+              </w:rPr>
+              <w:t>Luồng sự kiện chính</w:t>
+            </w:r>
+          </w:p>
+        </w:tc>
+        <w:tc>
+          <w:tcPr>
+            <w:tcW w:w="4675" w:type="dxa"/>
+          </w:tcPr>
+          <w:p>
+            <w:pPr>
+              <w:pStyle w:val="ListParagraph"/>
+              <w:numPr>
+                <w:ilvl w:val="0"/>
+                <w:numId w:val="6"/>
+              </w:numPr>
+              <w:rPr>
+                <w:rFonts w:ascii="Times New Roman" w:eastAsia="Bold" w:hAnsi="Times New Roman" w:cs="Times New Roman"/>
+                <w:sz w:val="26"/>
+                <w:szCs w:val="26"/>
+                <w:lang w:val="vi-VN"/>
+              </w:rPr>
+            </w:pPr>
+            <w:r>
+              <w:rPr>
+                <w:rFonts w:ascii="Times New Roman" w:eastAsia="Bold" w:hAnsi="Times New Roman" w:cs="Times New Roman"/>
+                <w:sz w:val="26"/>
+                <w:szCs w:val="26"/>
+                <w:lang w:val="vi-VN"/>
+              </w:rPr>
+              <w:t>Khách hàng bấm “Thêm vào giỏ hàng ” tại trang chủ (index.php).</w:t>
+            </w:r>
+          </w:p>
+          <w:p>
+            <w:pPr>
+              <w:pStyle w:val="ListParagraph"/>
+              <w:numPr>
+                <w:ilvl w:val="0"/>
+                <w:numId w:val="6"/>
+              </w:numPr>
+              <w:rPr>
+                <w:rFonts w:ascii="Times New Roman" w:eastAsia="Bold" w:hAnsi="Times New Roman" w:cs="Times New Roman"/>
+                <w:sz w:val="26"/>
+                <w:szCs w:val="26"/>
+                <w:lang w:val="vi-VN"/>
+              </w:rPr>
+            </w:pPr>
+            <w:r>
+              <w:rPr>
+                <w:rFonts w:ascii="Times New Roman" w:eastAsia="Bold" w:hAnsi="Times New Roman" w:cs="Times New Roman"/>
+                <w:sz w:val="26"/>
+                <w:szCs w:val="26"/>
+                <w:lang w:val="vi-VN"/>
+              </w:rPr>
+              <w:t>Hệ thống chuyển ID sản phẩm qua đường dẫn URL sang file xử lý ngầm (add_to_cart.php).</w:t>
+            </w:r>
+          </w:p>
+          <w:p>
+            <w:pPr>
+              <w:pStyle w:val="ListParagraph"/>
+              <w:numPr>
+                <w:ilvl w:val="0"/>
+                <w:numId w:val="6"/>
+              </w:numPr>
+              <w:rPr>
+                <w:rFonts w:ascii="Times New Roman" w:eastAsia="Bold" w:hAnsi="Times New Roman" w:cs="Times New Roman"/>
+                <w:sz w:val="26"/>
+                <w:szCs w:val="26"/>
+                <w:lang w:val="vi-VN"/>
+              </w:rPr>
+            </w:pPr>
+            <w:r>
+              <w:rPr>
+                <w:rFonts w:ascii="Times New Roman" w:eastAsia="Bold" w:hAnsi="Times New Roman" w:cs="Times New Roman"/>
+                <w:sz w:val="26"/>
+                <w:szCs w:val="26"/>
+                <w:lang w:val="vi-VN"/>
+              </w:rPr>
+              <w:t xml:space="preserve">Bộ nhớ Session lưu lại thông tin và tự động điều hướng sang trang hiển </w:t>
+            </w:r>
+            <w:r>
+              <w:rPr>
+                <w:rFonts w:ascii="Times New Roman" w:eastAsia="Bold" w:hAnsi="Times New Roman" w:cs="Times New Roman"/>
+                <w:sz w:val="26"/>
+                <w:szCs w:val="26"/>
+                <w:lang w:val="vi-VN"/>
+              </w:rPr>
+              <w:t>thị (cart.php).</w:t>
+            </w:r>
+          </w:p>
+          <w:p>
+            <w:pPr>
+              <w:pStyle w:val="ListParagraph"/>
+              <w:numPr>
+                <w:ilvl w:val="0"/>
+                <w:numId w:val="6"/>
+              </w:numPr>
+              <w:rPr>
+                <w:rFonts w:ascii="Times New Roman" w:eastAsia="Bold" w:hAnsi="Times New Roman" w:cs="Times New Roman"/>
+                <w:sz w:val="26"/>
+                <w:szCs w:val="26"/>
+                <w:lang w:val="vi-VN"/>
+              </w:rPr>
+            </w:pPr>
+            <w:r>
+              <w:rPr>
+                <w:rFonts w:ascii="Times New Roman" w:eastAsia="Bold" w:hAnsi="Times New Roman" w:cs="Times New Roman"/>
+                <w:sz w:val="26"/>
+                <w:szCs w:val="26"/>
+                <w:lang w:val="vi-VN"/>
+              </w:rPr>
+              <w:t>Hệ thống tính toán lại Thành tiền, Tổng tiền và hiển thị bảng dữ liệu ra màn hình</w:t>
+            </w:r>
+          </w:p>
+        </w:tc>
+      </w:tr>
+      <w:tr>
+        <w:tc>
+          <w:tcPr>
+            <w:tcW w:w="4675" w:type="dxa"/>
+          </w:tcPr>
+          <w:p>
+            <w:pPr>
+              <w:rPr>
+                <w:rFonts w:ascii="Times New Roman" w:eastAsia="Bold" w:hAnsi="Times New Roman" w:cs="Times New Roman"/>
+                <w:sz w:val="26"/>
+                <w:szCs w:val="26"/>
+                <w:lang w:val="vi-VN"/>
+              </w:rPr>
+            </w:pPr>
+            <w:r>
+              <w:rPr>
+                <w:rFonts w:ascii="Times New Roman" w:eastAsia="Bold" w:hAnsi="Times New Roman" w:cs="Times New Roman"/>
+                <w:sz w:val="26"/>
+                <w:szCs w:val="26"/>
+                <w:lang w:val="vi-VN"/>
+              </w:rPr>
+              <w:t>Luồng sự kiện thay thế</w:t>
+            </w:r>
+          </w:p>
+        </w:tc>
+        <w:tc>
+          <w:tcPr>
+            <w:tcW w:w="4675" w:type="dxa"/>
+          </w:tcPr>
+          <w:p>
+            <w:pPr>
+              <w:rPr>
+                <w:rFonts w:ascii="Times New Roman" w:eastAsia="Bold" w:hAnsi="Times New Roman" w:cs="Times New Roman"/>
+                <w:sz w:val="26"/>
+                <w:szCs w:val="26"/>
+                <w:lang w:val="vi-VN"/>
+              </w:rPr>
+            </w:pPr>
+            <w:r>
+              <w:rPr>
+                <w:rFonts w:ascii="Times New Roman" w:eastAsia="Bold" w:hAnsi="Times New Roman" w:cs="Times New Roman"/>
+                <w:sz w:val="26"/>
+                <w:szCs w:val="26"/>
+                <w:lang w:val="vi-VN"/>
+              </w:rPr>
+              <w:t>Trường hợp sản phẩm đã tồn tại: Hệ thống tự động cộng dồn số lượng của ID đó lên một đơn vị.</w:t>
+            </w:r>
+          </w:p>
+          <w:p>
+            <w:pPr>
+              <w:rPr>
+                <w:rFonts w:ascii="Times New Roman" w:eastAsia="Bold" w:hAnsi="Times New Roman" w:cs="Times New Roman"/>
+                <w:sz w:val="26"/>
+                <w:szCs w:val="26"/>
+                <w:lang w:val="vi-VN"/>
+              </w:rPr>
+            </w:pPr>
+            <w:r>
+              <w:rPr>
+                <w:rFonts w:ascii="Times New Roman" w:eastAsia="Bold" w:hAnsi="Times New Roman" w:cs="Times New Roman"/>
+                <w:sz w:val="26"/>
+                <w:szCs w:val="26"/>
+                <w:lang w:val="vi-VN"/>
+              </w:rPr>
+              <w:t>Trường hợp bấm nút giảm: Truyền tham số action_decrease sang update_cart.php để trừ số lượng đi một. Nếu số lượng bằng không, hệ thống tự động giải phóng(unset) sản phẩm khỏi giỏ.</w:t>
+            </w:r>
+          </w:p>
+          <w:p>
+            <w:pPr>
+              <w:rPr>
+                <w:rFonts w:ascii="Times New Roman" w:eastAsia="Bold" w:hAnsi="Times New Roman" w:cs="Times New Roman"/>
+                <w:sz w:val="26"/>
+                <w:szCs w:val="26"/>
+                <w:lang w:val="vi-VN"/>
+              </w:rPr>
+            </w:pPr>
+            <w:r>
+              <w:rPr>
+                <w:rFonts w:ascii="Times New Roman" w:eastAsia="Bold" w:hAnsi="Times New Roman" w:cs="Times New Roman"/>
+                <w:sz w:val="26"/>
+                <w:szCs w:val="26"/>
+                <w:lang w:val="vi-VN"/>
+              </w:rPr>
+              <w:t>Trường hợp bấm nút xóa: Truyền tham số action=delete sang update_cart.php, hệ thống thực hiện xóa hẳn phần tử mảng của ID đó ngay lập tức.</w:t>
+            </w:r>
+          </w:p>
+        </w:tc>
+      </w:tr>
+      <w:tr>
+        <w:tc>
+          <w:tcPr>
+            <w:tcW w:w="4675" w:type="dxa"/>
+          </w:tcPr>
+          <w:p>
+            <w:pPr>
+              <w:rPr>
+                <w:rFonts w:ascii="Times New Roman" w:eastAsia="Bold" w:hAnsi="Times New Roman" w:cs="Times New Roman"/>
+                <w:sz w:val="26"/>
+                <w:szCs w:val="26"/>
+                <w:lang w:val="vi-VN"/>
+              </w:rPr>
+            </w:pPr>
+            <w:r>
+              <w:rPr>
+                <w:rFonts w:ascii="Times New Roman" w:eastAsia="Bold" w:hAnsi="Times New Roman" w:cs="Times New Roman"/>
+                <w:sz w:val="26"/>
+                <w:szCs w:val="26"/>
+                <w:lang w:val="vi-VN"/>
+              </w:rPr>
+              <w:t>Điều kiện sau khi thực hiện</w:t>
+            </w:r>
+          </w:p>
+        </w:tc>
+        <w:tc>
+          <w:tcPr>
+            <w:tcW w:w="4675" w:type="dxa"/>
+          </w:tcPr>
+          <w:p>
+            <w:pPr>
+              <w:rPr>
+                <w:rFonts w:ascii="Times New Roman" w:eastAsia="Bold" w:hAnsi="Times New Roman" w:cs="Times New Roman"/>
+                <w:sz w:val="26"/>
+                <w:szCs w:val="26"/>
+                <w:lang w:val="vi-VN"/>
+              </w:rPr>
+            </w:pPr>
+            <w:r>
+              <w:rPr>
+                <w:rFonts w:ascii="Times New Roman" w:eastAsia="Bold" w:hAnsi="Times New Roman" w:cs="Times New Roman"/>
+                <w:sz w:val="26"/>
+                <w:szCs w:val="26"/>
+                <w:lang w:val="vi-VN"/>
+              </w:rPr>
+              <w:t>Mảng dữ liệu giỏ hàng thay đổi chính xác, giao diện hiển thị đồng bộ số lượng và tổng chi phi phí mới nhất.</w:t>
+            </w:r>
+          </w:p>
+        </w:tc>
+      </w:tr>
+    </w:tbl>
+    <w:p>
+      <w:pPr>
+        <w:rPr>
+          <w:rFonts w:ascii="Times New Roman" w:eastAsia="Bold" w:hAnsi="Times New Roman" w:cs="Times New Roman"/>
+          <w:sz w:val="26"/>
+          <w:szCs w:val="26"/>
+          <w:lang w:val="vi-VN"/>
+        </w:rPr>
+      </w:pPr>
+    </w:p>
     <w:sectPr>
-      <w:footerReference w:type="default" r:id="rId12"/>
+      <w:footerReference w:type="default" r:id="rId13"/>
       <w:pgSz w:w="12240" w:h="15840"/>
       <w:pgMar w:top="1440" w:right="1440" w:bottom="1440" w:left="1440" w:header="720" w:footer="720" w:gutter="0"/>
       <w:pgNumType w:start="1"/>
@@ -12980,6 +13879,184 @@
       </w:rPr>
     </w:lvl>
   </w:abstractNum>
+  <w:abstractNum w:abstractNumId="4" w15:restartNumberingAfterBreak="0">
+    <w:nsid w:val="6D511067"/>
+    <w:multiLevelType w:val="hybridMultilevel"/>
+    <w:tmpl w:val="BB482CC4"/>
+    <w:lvl w:ilvl="0" w:tplc="EBBE9258">
+      <w:start w:val="1"/>
+      <w:numFmt w:val="decimal"/>
+      <w:lvlText w:val="%1&gt;"/>
+      <w:lvlJc w:val="left"/>
+      <w:pPr>
+        <w:ind w:left="720" w:hanging="360"/>
+      </w:pPr>
+      <w:rPr>
+        <w:rFonts w:hint="default"/>
+      </w:rPr>
+    </w:lvl>
+    <w:lvl w:ilvl="1" w:tplc="04090019" w:tentative="1">
+      <w:start w:val="1"/>
+      <w:numFmt w:val="lowerLetter"/>
+      <w:lvlText w:val="%2."/>
+      <w:lvlJc w:val="left"/>
+      <w:pPr>
+        <w:ind w:left="1440" w:hanging="360"/>
+      </w:pPr>
+    </w:lvl>
+    <w:lvl w:ilvl="2" w:tplc="0409001B" w:tentative="1">
+      <w:start w:val="1"/>
+      <w:numFmt w:val="lowerRoman"/>
+      <w:lvlText w:val="%3."/>
+      <w:lvlJc w:val="right"/>
+      <w:pPr>
+        <w:ind w:left="2160" w:hanging="180"/>
+      </w:pPr>
+    </w:lvl>
+    <w:lvl w:ilvl="3" w:tplc="0409000F" w:tentative="1">
+      <w:start w:val="1"/>
+      <w:numFmt w:val="decimal"/>
+      <w:lvlText w:val="%4."/>
+      <w:lvlJc w:val="left"/>
+      <w:pPr>
+        <w:ind w:left="2880" w:hanging="360"/>
+      </w:pPr>
+    </w:lvl>
+    <w:lvl w:ilvl="4" w:tplc="04090019" w:tentative="1">
+      <w:start w:val="1"/>
+      <w:numFmt w:val="lowerLetter"/>
+      <w:lvlText w:val="%5."/>
+      <w:lvlJc w:val="left"/>
+      <w:pPr>
+        <w:ind w:left="3600" w:hanging="360"/>
+      </w:pPr>
+    </w:lvl>
+    <w:lvl w:ilvl="5" w:tplc="0409001B" w:tentative="1">
+      <w:start w:val="1"/>
+      <w:numFmt w:val="lowerRoman"/>
+      <w:lvlText w:val="%6."/>
+      <w:lvlJc w:val="right"/>
+      <w:pPr>
+        <w:ind w:left="4320" w:hanging="180"/>
+      </w:pPr>
+    </w:lvl>
+    <w:lvl w:ilvl="6" w:tplc="0409000F" w:tentative="1">
+      <w:start w:val="1"/>
+      <w:numFmt w:val="decimal"/>
+      <w:lvlText w:val="%7."/>
+      <w:lvlJc w:val="left"/>
+      <w:pPr>
+        <w:ind w:left="5040" w:hanging="360"/>
+      </w:pPr>
+    </w:lvl>
+    <w:lvl w:ilvl="7" w:tplc="04090019" w:tentative="1">
+      <w:start w:val="1"/>
+      <w:numFmt w:val="lowerLetter"/>
+      <w:lvlText w:val="%8."/>
+      <w:lvlJc w:val="left"/>
+      <w:pPr>
+        <w:ind w:left="5760" w:hanging="360"/>
+      </w:pPr>
+    </w:lvl>
+    <w:lvl w:ilvl="8" w:tplc="0409001B" w:tentative="1">
+      <w:start w:val="1"/>
+      <w:numFmt w:val="lowerRoman"/>
+      <w:lvlText w:val="%9."/>
+      <w:lvlJc w:val="right"/>
+      <w:pPr>
+        <w:ind w:left="6480" w:hanging="180"/>
+      </w:pPr>
+    </w:lvl>
+  </w:abstractNum>
+  <w:abstractNum w:abstractNumId="5" w15:restartNumberingAfterBreak="0">
+    <w:nsid w:val="746F2292"/>
+    <w:multiLevelType w:val="hybridMultilevel"/>
+    <w:tmpl w:val="B958F254"/>
+    <w:lvl w:ilvl="0" w:tplc="0409000F">
+      <w:start w:val="1"/>
+      <w:numFmt w:val="decimal"/>
+      <w:lvlText w:val="%1."/>
+      <w:lvlJc w:val="left"/>
+      <w:pPr>
+        <w:ind w:left="720" w:hanging="360"/>
+      </w:pPr>
+      <w:rPr>
+        <w:rFonts w:hint="default"/>
+      </w:rPr>
+    </w:lvl>
+    <w:lvl w:ilvl="1" w:tplc="04090019" w:tentative="1">
+      <w:start w:val="1"/>
+      <w:numFmt w:val="lowerLetter"/>
+      <w:lvlText w:val="%2."/>
+      <w:lvlJc w:val="left"/>
+      <w:pPr>
+        <w:ind w:left="1440" w:hanging="360"/>
+      </w:pPr>
+    </w:lvl>
+    <w:lvl w:ilvl="2" w:tplc="0409001B" w:tentative="1">
+      <w:start w:val="1"/>
+      <w:numFmt w:val="lowerRoman"/>
+      <w:lvlText w:val="%3."/>
+      <w:lvlJc w:val="right"/>
+      <w:pPr>
+        <w:ind w:left="2160" w:hanging="180"/>
+      </w:pPr>
+    </w:lvl>
+    <w:lvl w:ilvl="3" w:tplc="0409000F" w:tentative="1">
+      <w:start w:val="1"/>
+      <w:numFmt w:val="decimal"/>
+      <w:lvlText w:val="%4."/>
+      <w:lvlJc w:val="left"/>
+      <w:pPr>
+        <w:ind w:left="2880" w:hanging="360"/>
+      </w:pPr>
+    </w:lvl>
+    <w:lvl w:ilvl="4" w:tplc="04090019" w:tentative="1">
+      <w:start w:val="1"/>
+      <w:numFmt w:val="lowerLetter"/>
+      <w:lvlText w:val="%5."/>
+      <w:lvlJc w:val="left"/>
+      <w:pPr>
+        <w:ind w:left="3600" w:hanging="360"/>
+      </w:pPr>
+    </w:lvl>
+    <w:lvl w:ilvl="5" w:tplc="0409001B" w:tentative="1">
+      <w:start w:val="1"/>
+      <w:numFmt w:val="lowerRoman"/>
+      <w:lvlText w:val="%6."/>
+      <w:lvlJc w:val="right"/>
+      <w:pPr>
+        <w:ind w:left="4320" w:hanging="180"/>
+      </w:pPr>
+    </w:lvl>
+    <w:lvl w:ilvl="6" w:tplc="0409000F" w:tentative="1">
+      <w:start w:val="1"/>
+      <w:numFmt w:val="decimal"/>
+      <w:lvlText w:val="%7."/>
+      <w:lvlJc w:val="left"/>
+      <w:pPr>
+        <w:ind w:left="5040" w:hanging="360"/>
+      </w:pPr>
+    </w:lvl>
+    <w:lvl w:ilvl="7" w:tplc="04090019" w:tentative="1">
+      <w:start w:val="1"/>
+      <w:numFmt w:val="lowerLetter"/>
+      <w:lvlText w:val="%8."/>
+      <w:lvlJc w:val="left"/>
+      <w:pPr>
+        <w:ind w:left="5760" w:hanging="360"/>
+      </w:pPr>
+    </w:lvl>
+    <w:lvl w:ilvl="8" w:tplc="0409001B" w:tentative="1">
+      <w:start w:val="1"/>
+      <w:numFmt w:val="lowerRoman"/>
+      <w:lvlText w:val="%9."/>
+      <w:lvlJc w:val="right"/>
+      <w:pPr>
+        <w:ind w:left="6480" w:hanging="180"/>
+      </w:pPr>
+    </w:lvl>
+  </w:abstractNum>
   <w:num w:numId="1" w16cid:durableId="1174761426">
     <w:abstractNumId w:val="2"/>
   </w:num>
@@ -12991,6 +14068,12 @@
   </w:num>
   <w:num w:numId="4" w16cid:durableId="1127428641">
     <w:abstractNumId w:val="3"/>
+  </w:num>
+  <w:num w:numId="5" w16cid:durableId="860514076">
+    <w:abstractNumId w:val="4"/>
+  </w:num>
+  <w:num w:numId="6" w16cid:durableId="2087191440">
+    <w:abstractNumId w:val="5"/>
   </w:num>
 </w:numbering>
 </file>
@@ -13604,6 +14687,7 @@
   <w:style w:type="character" w:default="1" w:styleId="DefaultParagraphFont">
     <w:name w:val="Default Paragraph Font"/>
     <w:uiPriority w:val="1"/>
+    <w:semiHidden/>
     <w:unhideWhenUsed/>
   </w:style>
   <w:style w:type="table" w:default="1" w:styleId="TableNormal">

</xml_diff>